<commit_message>
fix(task-b): sanitize corpus titles and ban review snippets in output
- Add prompt_display_title and snippet detection for clean Display names

- Strengthen Groq generator and router prompts with strict name parsing rules

- Reject paragraphs that echo raw review text as product names

- Refresh solution paper and exported DOCX/PDF for submission
</commit_message>
<xml_diff>
--- a/docs/SOLUTION_PAPER.docx
+++ b/docs/SOLUTION_PAPER.docx
@@ -7,7 +7,7 @@
         <w:pStyle w:val="Heading1"/>
       </w:pPr>
       <w:r>
-        <w:t>NaijaSense AI — Solution Paper</w:t>
+        <w:t>NaijaSense AI - Solution Paper</w:t>
       </w:r>
     </w:p>
     <w:p>
@@ -46,7 +46,16 @@
         <w:t>Task B</w:t>
       </w:r>
       <w:r>
-        <w:t xml:space="preserve"> ranks recommendations from a persona-only narrative with mandatory </w:t>
+        <w:t xml:space="preserve"> returns a grounded lifestyle recommendation </w:t>
+      </w:r>
+      <w:r>
+        <w:rPr>
+          <w:b/>
+        </w:rPr>
+        <w:t>paragraph</w:t>
+      </w:r>
+      <w:r>
+        <w:t xml:space="preserve"> from a persona-only narrative with mandatory </w:t>
       </w:r>
       <w:r>
         <w:rPr>
@@ -82,7 +91,16 @@
         <w:t>llama-3.3-70b-versatile</w:t>
       </w:r>
       <w:r>
-        <w:t>), grounded in a 311-row Yelp/Goodreads/Amazon corpus with Nigerian cold-start defaults. A unified hub (</w:t>
+        <w:t xml:space="preserve">), grounded in a single </w:t>
+      </w:r>
+      <w:r>
+        <w:rPr>
+          <w:b/>
+        </w:rPr>
+        <w:t>5,011-row</w:t>
+      </w:r>
+      <w:r>
+        <w:t xml:space="preserve"> Yelp/Amazon/Goodreads corpus (few-shots, silent history, and Task B stage-1 retrieval share one inverted index). A unified hub (</w:t>
       </w:r>
       <w:r>
         <w:rPr>
@@ -102,7 +120,7 @@
         <w:t>Endpoints:</w:t>
       </w:r>
       <w:r>
-        <w:t xml:space="preserve"> Task A — </w:t>
+        <w:t xml:space="preserve"> Task A - </w:t>
       </w:r>
       <w:r>
         <w:rPr>
@@ -111,7 +129,7 @@
         <w:t>https://naija-sense-ai.vercel.app/task-a/user-modeling</w:t>
       </w:r>
       <w:r>
-        <w:t xml:space="preserve"> · Task B — </w:t>
+        <w:t xml:space="preserve"> · Task B - </w:t>
       </w:r>
       <w:r>
         <w:rPr>
@@ -120,7 +138,7 @@
         <w:t>https://naija-sense-ai.vercel.app/task-b/recommendation</w:t>
       </w:r>
       <w:r>
-        <w:t xml:space="preserve"> · Code — </w:t>
+        <w:t xml:space="preserve"> · Code - </w:t>
       </w:r>
       <w:r>
         <w:rPr>
@@ -139,7 +157,7 @@
     </w:p>
     <w:p>
       <w:r>
-        <w:t>Reviews encode tone, rating bias, and domain taste. We target auditable agents—not opaque chat—with strict I/O per task.</w:t>
+        <w:t>Reviews encode tone, rating bias, and domain taste. We target auditable agents - not opaque chat - with strict I/O per task.</w:t>
       </w:r>
     </w:p>
     <w:tbl>
@@ -331,10 +349,10 @@
               <w:rPr>
                 <w:rFonts w:ascii="Mono" w:hAnsi="Mono"/>
               </w:rPr>
-              <w:t>recommendations[]</w:t>
+              <w:t>recommendations</w:t>
             </w:r>
             <w:r>
-              <w:t xml:space="preserve">, </w:t>
+              <w:t xml:space="preserve"> (paragraph), </w:t>
             </w:r>
             <w:r>
               <w:rPr>
@@ -420,9 +438,12 @@
     C[Client] --&gt; TA[Task A: two-pass agent]
     C --&gt; TB[Task B: retrieve then rerank]
     TA --&gt; R1[rating + reasoning + review]
-    TB --&gt; S1[Top-30 corpus pool]
-    S1 --&gt; S2[LLM rerank + agent_reasoning]
-    S2 --&gt; R2[ranked recommendations]
+    TB --&gt; P2[parse persona + intent]
+    P2 --&gt; S1[Top-30 from 5k corpus]
+    S1 --&gt; D1[diversify + dedupe variants]
+    D1 --&gt; S2[Groq router rank]
+    S2 --&gt; S3[Groq generator paragraph]
+    S3 --&gt; R2[recommendations + agent_reasoning]
 </w:t>
       </w:r>
     </w:p>
@@ -483,7 +504,7 @@
         <w:t>Pass 2 (generator):</w:t>
       </w:r>
       <w:r>
-        <w:t xml:space="preserve"> 2–4 sentence review with </w:t>
+        <w:t xml:space="preserve"> 2-4 sentence review with </w:t>
       </w:r>
       <w:r>
         <w:rPr>
@@ -516,7 +537,7 @@
         <w:t>).</w:t>
       </w:r>
       <w:r>
-        <w:t xml:space="preserve"> Parse persona (location, budget, interests; no separate query) → </w:t>
+        <w:t xml:space="preserve"> Parse persona and intent (lifestyle, advisory-only learning/career, or team-culture hiring) → </w:t>
       </w:r>
       <w:r>
         <w:rPr>
@@ -525,16 +546,25 @@
         <w:t>Stage 1:</w:t>
       </w:r>
       <w:r>
-        <w:t xml:space="preserve"> top-30 candidates from catalog + Nigerian cold-start/cross-domain priors → </w:t>
+        <w:t xml:space="preserve"> top-30 candidates from the full </w:t>
       </w:r>
       <w:r>
         <w:rPr>
           <w:b/>
         </w:rPr>
-        <w:t>Stage 2 (router):</w:t>
+        <w:t>5,011-row</w:t>
       </w:r>
       <w:r>
-        <w:t xml:space="preserve"> Reason-Before-Recommend monologue + JSON rankings (</w:t>
+        <w:t xml:space="preserve"> corpus index (diversified, variant titles collapsed) → </w:t>
+      </w:r>
+      <w:r>
+        <w:rPr>
+          <w:b/>
+        </w:rPr>
+        <w:t>Stage 2 (Groq):</w:t>
+      </w:r>
+      <w:r>
+        <w:t xml:space="preserve"> router ranks </w:t>
       </w:r>
       <w:r>
         <w:rPr>
@@ -543,16 +573,25 @@
         <w:t>item_id</w:t>
       </w:r>
       <w:r>
-        <w:t xml:space="preserve">, </w:t>
+        <w:t xml:space="preserve">s → generator writes one grounded </w:t>
       </w:r>
       <w:r>
         <w:rPr>
           <w:rFonts w:ascii="Mono" w:hAnsi="Mono"/>
         </w:rPr>
-        <w:t>confidence_score</w:t>
+        <w:t>recommendations</w:t>
       </w:r>
       <w:r>
-        <w:t>); stage-1 fallback on parse error.</w:t>
+        <w:t xml:space="preserve"> paragraph with </w:t>
+      </w:r>
+      <w:r>
+        <w:rPr>
+          <w:rFonts w:ascii="Mono" w:hAnsi="Mono"/>
+        </w:rPr>
+        <w:t>agent_reasoning</w:t>
+      </w:r>
+      <w:r>
+        <w:t>; stage-1 template fallback if Groq fails.</w:t>
       </w:r>
     </w:p>
     <w:p>
@@ -581,7 +620,7 @@
         <w:t>user_id</w:t>
       </w:r>
       <w:r>
-        <w:t xml:space="preserve">, critique→regenerate, streaming NDJSON, and pidgin/Yoruba modes—used for UX and </w:t>
+        <w:t xml:space="preserve">, critique→regenerate, streaming NDJSON, and pidgin/Yoruba modes - used for UX and </w:t>
       </w:r>
       <w:r>
         <w:rPr>
@@ -591,66 +630,6 @@
       </w:r>
       <w:r>
         <w:t xml:space="preserve"> ablations only.</w:t>
-      </w:r>
-    </w:p>
-    <w:p>
-      <w:pPr>
-        <w:jc w:val="center"/>
-      </w:pPr>
-      <w:r>
-        <w:drawing>
-          <wp:inline xmlns:a="http://schemas.openxmlformats.org/drawingml/2006/main" xmlns:pic="http://schemas.openxmlformats.org/drawingml/2006/picture">
-            <wp:extent cx="5303520" cy="5303520"/>
-            <wp:docPr id="1" name="Picture 1"/>
-            <wp:cNvGraphicFramePr>
-              <a:graphicFrameLocks noChangeAspect="1"/>
-            </wp:cNvGraphicFramePr>
-            <a:graphic>
-              <a:graphicData uri="http://schemas.openxmlformats.org/drawingml/2006/picture">
-                <pic:pic>
-                  <pic:nvPicPr>
-                    <pic:cNvPr id="0" name="image.png"/>
-                    <pic:cNvPicPr/>
-                  </pic:nvPicPr>
-                  <pic:blipFill>
-                    <a:blip r:embed="rId9"/>
-                    <a:stretch>
-                      <a:fillRect/>
-                    </a:stretch>
-                  </pic:blipFill>
-                  <pic:spPr>
-                    <a:xfrm>
-                      <a:off x="0" y="0"/>
-                      <a:ext cx="5303520" cy="5303520"/>
-                    </a:xfrm>
-                    <a:prstGeom prst="rect"/>
-                  </pic:spPr>
-                </pic:pic>
-              </a:graphicData>
-            </a:graphic>
-          </wp:inline>
-        </w:drawing>
-      </w:r>
-    </w:p>
-    <w:p>
-      <w:r>
-        <w:rPr>
-          <w:i/>
-        </w:rPr>
-        <w:t xml:space="preserve">Figure 1. Behavioral Intelligence Hub output (supplementary demo at </w:t>
-      </w:r>
-      <w:r>
-        <w:rPr>
-          <w:rFonts w:ascii="Mono" w:hAnsi="Mono"/>
-          <w:i/>
-        </w:rPr>
-        <w:t>/unified</w:t>
-      </w:r>
-      <w:r>
-        <w:rPr>
-          <w:i/>
-        </w:rPr>
-        <w:t>).</w:t>
       </w:r>
     </w:p>
     <w:p>
@@ -675,10 +654,19 @@
         <w:rPr>
           <w:rFonts w:ascii="Mono" w:hAnsi="Mono"/>
         </w:rPr>
-        <w:t>data/processed/review_corpus.jsonl</w:t>
+        <w:t>review_corpus.jsonl</w:t>
       </w:r>
       <w:r>
-        <w:t xml:space="preserve"> — 311 rows (Yelp 274, Goodreads 31, Amazon 6). </w:t>
+        <w:t xml:space="preserve"> - </w:t>
+      </w:r>
+      <w:r>
+        <w:rPr>
+          <w:b/>
+        </w:rPr>
+        <w:t>5,011</w:t>
+      </w:r>
+      <w:r>
+        <w:t xml:space="preserve"> rows (Yelp 2,498, Amazon 2,482, Goodreads 31 + curated seeds), fully indexed for Task A and Task B. </w:t>
       </w:r>
       <w:r>
         <w:rPr>
@@ -687,7 +675,16 @@
         <w:t>Models:</w:t>
       </w:r>
       <w:r>
-        <w:t xml:space="preserve"> Groq router + generator; </w:t>
+        <w:t xml:space="preserve"> Groq router + generator via </w:t>
+      </w:r>
+      <w:r>
+        <w:rPr>
+          <w:rFonts w:ascii="Mono" w:hAnsi="Mono"/>
+        </w:rPr>
+        <w:t>GROQ_API_KEY</w:t>
+      </w:r>
+      <w:r>
+        <w:t xml:space="preserve"> and </w:t>
       </w:r>
       <w:r>
         <w:rPr>
@@ -705,7 +702,7 @@
         <w:t>Metrics:</w:t>
       </w:r>
       <w:r>
-        <w:t xml:space="preserve"> Task A — ROUGE-1/L, token-F1 (BERTScore fallback), RMSE; Task B — NDCG@10, Hit@10 (</w:t>
+        <w:t xml:space="preserve"> Task A - ROUGE-1/L, token-F1 (BERTScore fallback), RMSE; Task B - NDCG@10, Hit@10 (</w:t>
       </w:r>
       <w:r>
         <w:rPr>
@@ -752,7 +749,7 @@
         <w:t>no_llm</w:t>
       </w:r>
       <w:r>
-        <w:t xml:space="preserve"> ROUGE-1 0.126 — LLM is the main lever. Submission adds </w:t>
+        <w:t xml:space="preserve"> ROUGE-1 0.126 - LLM is the main lever. Submission adds </w:t>
       </w:r>
       <w:r>
         <w:rPr>
@@ -761,7 +758,7 @@
         <w:t>two-pass rating lock</w:t>
       </w:r>
       <w:r>
-        <w:t xml:space="preserve"> to cut score–text drift. </w:t>
+        <w:t xml:space="preserve"> to cut score-text drift. </w:t>
       </w:r>
       <w:r>
         <w:rPr>
@@ -779,7 +776,7 @@
         <w:t>submission</w:t>
       </w:r>
       <w:r>
-        <w:t xml:space="preserve"> uses LLM rerank over stage-1 pool to address this.</w:t>
+        <w:t xml:space="preserve"> uses Groq two-step rerank over the stage-1 pool to address this.</w:t>
       </w:r>
     </w:p>
     <w:p>
@@ -822,7 +819,7 @@
         <w:t>Limits:</w:t>
       </w:r>
       <w:r>
-        <w:t xml:space="preserve"> (1) Ablations ≠ submission pipelines—score </w:t>
+        <w:t xml:space="preserve"> (1) Ablations ≠ submission pipelines - score </w:t>
       </w:r>
       <w:r>
         <w:rPr>
@@ -840,7 +837,7 @@
         <w:t>/task-b</w:t>
       </w:r>
       <w:r>
-        <w:t xml:space="preserve"> directly; (2) Task A persona must be self-contained (no silent history on submission route); (3) Task B rerank depends on stage-1 recall; (4) Amazon slice undersampled when HF was unavailable.</w:t>
+        <w:t xml:space="preserve"> directly; (2) Task A persona must be self-contained (no silent history on submission route); (3) Task B quality depends on stage-1 recall and LLM grounding; (4) Task B is lifestyle recommendation, not HR or general career consulting - advisory-only personas are steered to books/tech picks, not random restaurants.</w:t>
       </w:r>
     </w:p>
     <w:p>
@@ -853,7 +850,7 @@
     </w:p>
     <w:p>
       <w:r>
-        <w:t xml:space="preserve">NaijaSense AI ships two deployable, explainable agents from one repo: Task A with domain-aware two-pass review simulation, Task B with corpus retrieval and mandatory </w:t>
+        <w:t xml:space="preserve">NaijaSense AI ships two deployable, explainable agents from one repo: Task A with domain-aware two-pass review simulation, Task B with corpus retrieval, Groq rerank, and mandatory </w:t>
       </w:r>
       <w:r>
         <w:rPr>
@@ -862,7 +859,7 @@
         <w:t>agent_reasoning</w:t>
       </w:r>
       <w:r>
-        <w:t>. One solution paper covers both tasks; each task has its own agent URL. The hub supports iteration; the endpoints in §1 are the primary evaluation surface.</w:t>
+        <w:t xml:space="preserve"> in a single recommendation paragraph. One solution paper covers both tasks; each task has its own agent URL. The hub supports iteration; the endpoints in §1 are the primary evaluation surface.</w:t>
       </w:r>
     </w:p>
     <w:sectPr>

</xml_diff>